<commit_message>
Shorten one-page NDA so it fits A4 in Word
Co-Authored-By: Claude Sonnet 5.5 <noreply@anthropic.com>
Claude-Session: https://claude.ai/code/session_01TRZ9tz7efyNXVsPx8VtPvB
</commit_message>
<xml_diff>
--- a/秘密保持契約書_要約1枚版.docx
+++ b/秘密保持契約書_要約1枚版.docx
@@ -4,12 +4,12 @@
   <w:body>
     <w:p>
       <w:pPr>
-        <w:spacing w:before="0" w:after="120" w:line="252" w:lineRule="auto"/>
+        <w:spacing w:before="0" w:after="120" w:line="250" w:lineRule="exact"/>
         <w:jc w:val="center"/>
       </w:pPr>
       <w:r>
         <w:rPr>
-          <w:rFonts w:ascii="游明朝" w:hAnsi="游明朝" w:eastAsia="游明朝"/>
+          <w:rFonts w:ascii="MS 明朝" w:hAnsi="MS 明朝" w:eastAsia="MS 明朝"/>
           <w:b/>
           <w:sz w:val="30"/>
         </w:rPr>
@@ -18,11 +18,11 @@
     </w:p>
     <w:p>
       <w:pPr>
-        <w:spacing w:before="0" w:after="60" w:line="252" w:lineRule="auto"/>
+        <w:spacing w:before="0" w:after="60" w:line="250" w:lineRule="exact"/>
       </w:pPr>
       <w:r>
         <w:rPr>
-          <w:rFonts w:ascii="游明朝" w:hAnsi="游明朝" w:eastAsia="游明朝"/>
+          <w:rFonts w:ascii="MS 明朝" w:hAnsi="MS 明朝" w:eastAsia="MS 明朝"/>
           <w:b w:val="0"/>
         </w:rPr>
         <w:t>【開示者】（以下「甲」という）と【受領者】（以下「乙」という）は、甲が乙に開示する秘密情報の取扱いについて、以下のとおり契約（以下「本契約」という）を締結する。</w:t>
@@ -30,11 +30,11 @@
     </w:p>
     <w:p>
       <w:pPr>
-        <w:spacing w:before="60" w:after="0" w:line="252" w:lineRule="auto"/>
+        <w:spacing w:before="60" w:after="0" w:line="250" w:lineRule="exact"/>
       </w:pPr>
       <w:r>
         <w:rPr>
-          <w:rFonts w:ascii="游明朝" w:hAnsi="游明朝" w:eastAsia="游明朝"/>
+          <w:rFonts w:ascii="MS 明朝" w:hAnsi="MS 明朝" w:eastAsia="MS 明朝"/>
           <w:b/>
         </w:rPr>
         <w:t>第1条（目的）</w:t>
@@ -42,24 +42,24 @@
     </w:p>
     <w:p>
       <w:pPr>
-        <w:spacing w:before="0" w:after="40" w:line="252" w:lineRule="auto"/>
+        <w:spacing w:before="0" w:after="40" w:line="250" w:lineRule="exact"/>
         <w:ind w:left="227"/>
       </w:pPr>
       <w:r>
         <w:rPr>
-          <w:rFonts w:ascii="游明朝" w:hAnsi="游明朝" w:eastAsia="游明朝"/>
+          <w:rFonts w:ascii="MS 明朝" w:hAnsi="MS 明朝" w:eastAsia="MS 明朝"/>
           <w:b w:val="0"/>
         </w:rPr>
-        <w:t>甲は、　　　　　　　　　　（以下「本目的」という）のために、乙に対して秘密情報を開示し、乙はこれを受領する。</w:t>
+        <w:t>甲は、　　　　　　　　　　（以下「本目的」という）のために、乙に秘密情報を開示し、乙はこれを受領する。</w:t>
       </w:r>
     </w:p>
     <w:p>
       <w:pPr>
-        <w:spacing w:before="60" w:after="0" w:line="252" w:lineRule="auto"/>
+        <w:spacing w:before="60" w:after="0" w:line="250" w:lineRule="exact"/>
       </w:pPr>
       <w:r>
         <w:rPr>
-          <w:rFonts w:ascii="游明朝" w:hAnsi="游明朝" w:eastAsia="游明朝"/>
+          <w:rFonts w:ascii="MS 明朝" w:hAnsi="MS 明朝" w:eastAsia="MS 明朝"/>
           <w:b/>
         </w:rPr>
         <w:t>第2条（秘密情報）</w:t>
@@ -67,37 +67,37 @@
     </w:p>
     <w:p>
       <w:pPr>
-        <w:spacing w:before="0" w:after="40" w:line="252" w:lineRule="auto"/>
+        <w:spacing w:before="0" w:after="40" w:line="250" w:lineRule="exact"/>
         <w:ind w:left="227"/>
       </w:pPr>
       <w:r>
         <w:rPr>
-          <w:rFonts w:ascii="游明朝" w:hAnsi="游明朝" w:eastAsia="游明朝"/>
+          <w:rFonts w:ascii="MS 明朝" w:hAnsi="MS 明朝" w:eastAsia="MS 明朝"/>
           <w:b w:val="0"/>
         </w:rPr>
-        <w:t>1. 「秘密情報」とは、甲が乙に開示した情報（書面・電磁的記録・口頭を問わない）のうち、秘密である旨を示したもの、または性質上秘密と認められるものをいい、本契約の存在及び内容も含む。</w:t>
+        <w:t>1. 「秘密情報」とは、甲が乙に開示した情報（方法を問わない）のうち、秘密である旨を示したもの、または性質上秘密と認められるもの（本契約の存在及び内容を含む）をいう。</w:t>
       </w:r>
     </w:p>
     <w:p>
       <w:pPr>
-        <w:spacing w:before="0" w:after="40" w:line="252" w:lineRule="auto"/>
+        <w:spacing w:before="0" w:after="40" w:line="250" w:lineRule="exact"/>
         <w:ind w:left="227"/>
       </w:pPr>
       <w:r>
         <w:rPr>
-          <w:rFonts w:ascii="游明朝" w:hAnsi="游明朝" w:eastAsia="游明朝"/>
+          <w:rFonts w:ascii="MS 明朝" w:hAnsi="MS 明朝" w:eastAsia="MS 明朝"/>
           <w:b w:val="0"/>
         </w:rPr>
-        <w:t>2. 次のいずれかに該当することを乙が立証できる情報は除く：(1)すでに公知 (2)乙の責めによらず公知となったもの (3)乙がすでに適法に保有していたもの (4)秘密保持義務なく第三者から適法に取得したもの (5)秘密情報を利用せず独自に開発したもの</w:t>
+        <w:t>2. 公知の情報、乙が適法に保有していた情報、第三者から適法に取得した情報、独自に開発した情報は除く（乙が立証できる場合に限る）。</w:t>
       </w:r>
     </w:p>
     <w:p>
       <w:pPr>
-        <w:spacing w:before="60" w:after="0" w:line="252" w:lineRule="auto"/>
+        <w:spacing w:before="60" w:after="0" w:line="250" w:lineRule="exact"/>
       </w:pPr>
       <w:r>
         <w:rPr>
-          <w:rFonts w:ascii="游明朝" w:hAnsi="游明朝" w:eastAsia="游明朝"/>
+          <w:rFonts w:ascii="MS 明朝" w:hAnsi="MS 明朝" w:eastAsia="MS 明朝"/>
           <w:b/>
         </w:rPr>
         <w:t>第3条（秘密保持義務）</w:t>
@@ -105,12 +105,12 @@
     </w:p>
     <w:p>
       <w:pPr>
-        <w:spacing w:before="0" w:after="40" w:line="252" w:lineRule="auto"/>
+        <w:spacing w:before="0" w:after="40" w:line="250" w:lineRule="exact"/>
         <w:ind w:left="227"/>
       </w:pPr>
       <w:r>
         <w:rPr>
-          <w:rFonts w:ascii="游明朝" w:hAnsi="游明朝" w:eastAsia="游明朝"/>
+          <w:rFonts w:ascii="MS 明朝" w:hAnsi="MS 明朝" w:eastAsia="MS 明朝"/>
           <w:b w:val="0"/>
         </w:rPr>
         <w:t>1. 乙は、秘密情報を厳重に管理し、甲の事前の書面（電子メール等を含む）による承諾なく、第三者に開示・漏えいしてはならない。</w:t>
@@ -118,62 +118,49 @@
     </w:p>
     <w:p>
       <w:pPr>
-        <w:spacing w:before="0" w:after="40" w:line="252" w:lineRule="auto"/>
+        <w:spacing w:before="0" w:after="40" w:line="250" w:lineRule="exact"/>
         <w:ind w:left="227"/>
       </w:pPr>
       <w:r>
         <w:rPr>
-          <w:rFonts w:ascii="游明朝" w:hAnsi="游明朝" w:eastAsia="游明朝"/>
+          <w:rFonts w:ascii="MS 明朝" w:hAnsi="MS 明朝" w:eastAsia="MS 明朝"/>
           <w:b w:val="0"/>
         </w:rPr>
-        <w:t>2. 乙は、自己の情報と同等以上、少なくとも善管注意をもって、紛失・盗難・不正アクセス等を防止する措置を講じる。</w:t>
+        <w:t>2. 乙は、秘密情報をSNS、ブログ、動画配信サイト、チャットグループ等、不特定または多数が閲覧できる場所に掲載・投稿してはならない。</w:t>
       </w:r>
     </w:p>
     <w:p>
       <w:pPr>
-        <w:spacing w:before="0" w:after="40" w:line="252" w:lineRule="auto"/>
+        <w:spacing w:before="60" w:after="0" w:line="250" w:lineRule="exact"/>
+      </w:pPr>
+      <w:r>
+        <w:rPr>
+          <w:rFonts w:ascii="MS 明朝" w:hAnsi="MS 明朝" w:eastAsia="MS 明朝"/>
+          <w:b/>
+        </w:rPr>
+        <w:t>第4条（目的外使用・複製の禁止）</w:t>
+      </w:r>
+    </w:p>
+    <w:p>
+      <w:pPr>
+        <w:spacing w:before="0" w:after="40" w:line="250" w:lineRule="exact"/>
         <w:ind w:left="227"/>
       </w:pPr>
       <w:r>
         <w:rPr>
-          <w:rFonts w:ascii="游明朝" w:hAnsi="游明朝" w:eastAsia="游明朝"/>
+          <w:rFonts w:ascii="MS 明朝" w:hAnsi="MS 明朝" w:eastAsia="MS 明朝"/>
           <w:b w:val="0"/>
         </w:rPr>
-        <w:t>3. 乙は、秘密情報をSNS、ブログ、動画配信サイト、チャットグループ等、不特定または多数が閲覧できる場所に掲載・投稿してはならない。</w:t>
+        <w:t>乙は、秘密情報を本目的以外に使用し、または本目的に必要な範囲を超えて複製してはならない。</w:t>
       </w:r>
     </w:p>
     <w:p>
       <w:pPr>
-        <w:spacing w:before="60" w:after="0" w:line="252" w:lineRule="auto"/>
+        <w:spacing w:before="60" w:after="0" w:line="250" w:lineRule="exact"/>
       </w:pPr>
       <w:r>
         <w:rPr>
-          <w:rFonts w:ascii="游明朝" w:hAnsi="游明朝" w:eastAsia="游明朝"/>
-          <w:b/>
-        </w:rPr>
-        <w:t>第4条（目的外使用の禁止）</w:t>
-      </w:r>
-    </w:p>
-    <w:p>
-      <w:pPr>
-        <w:spacing w:before="0" w:after="40" w:line="252" w:lineRule="auto"/>
-        <w:ind w:left="227"/>
-      </w:pPr>
-      <w:r>
-        <w:rPr>
-          <w:rFonts w:ascii="游明朝" w:hAnsi="游明朝" w:eastAsia="游明朝"/>
-          <w:b w:val="0"/>
-        </w:rPr>
-        <w:t>乙は、秘密情報を本目的以外に使用してはならず、加工・改変・分析して自己または第三者のために利用してはならない。</w:t>
-      </w:r>
-    </w:p>
-    <w:p>
-      <w:pPr>
-        <w:spacing w:before="60" w:after="0" w:line="252" w:lineRule="auto"/>
-      </w:pPr>
-      <w:r>
-        <w:rPr>
-          <w:rFonts w:ascii="游明朝" w:hAnsi="游明朝" w:eastAsia="游明朝"/>
+          <w:rFonts w:ascii="MS 明朝" w:hAnsi="MS 明朝" w:eastAsia="MS 明朝"/>
           <w:b/>
         </w:rPr>
         <w:t>第5条（開示の範囲）</w:t>
@@ -181,100 +168,75 @@
     </w:p>
     <w:p>
       <w:pPr>
-        <w:spacing w:before="0" w:after="40" w:line="252" w:lineRule="auto"/>
+        <w:spacing w:before="0" w:after="40" w:line="250" w:lineRule="exact"/>
         <w:ind w:left="227"/>
       </w:pPr>
       <w:r>
         <w:rPr>
-          <w:rFonts w:ascii="游明朝" w:hAnsi="游明朝" w:eastAsia="游明朝"/>
+          <w:rFonts w:ascii="MS 明朝" w:hAnsi="MS 明朝" w:eastAsia="MS 明朝"/>
           <w:b w:val="0"/>
         </w:rPr>
-        <w:t>1. 乙は、本目的のために知る必要がある乙の役員・従業員・協力者（以下「関係者」）に限り、必要最小限の範囲で開示できる。乙は関係者に本契約と同等の義務を課し、その違反について自ら責任を負う。</w:t>
+        <w:t>1. 乙は、本目的のために知る必要がある乙の役員・従業員・協力者に限り、必要最小限の範囲で開示できる。乙は、これらの者に本契約と同等の義務を課し、その違反について責任を負う。</w:t>
       </w:r>
     </w:p>
     <w:p>
       <w:pPr>
-        <w:spacing w:before="0" w:after="40" w:line="252" w:lineRule="auto"/>
+        <w:spacing w:before="0" w:after="40" w:line="250" w:lineRule="exact"/>
         <w:ind w:left="227"/>
       </w:pPr>
       <w:r>
         <w:rPr>
-          <w:rFonts w:ascii="游明朝" w:hAnsi="游明朝" w:eastAsia="游明朝"/>
+          <w:rFonts w:ascii="MS 明朝" w:hAnsi="MS 明朝" w:eastAsia="MS 明朝"/>
           <w:b w:val="0"/>
         </w:rPr>
-        <w:t>2. 法令・裁判所・行政機関の命令により開示を求められた場合、乙は法令上可能な範囲で事前に甲へ通知し、開示は必要最小限にとどめる。</w:t>
+        <w:t>2. 法令等により開示を求められた場合、乙は可能な範囲で事前に甲へ通知し、開示は必要最小限にとどめる。</w:t>
       </w:r>
     </w:p>
     <w:p>
       <w:pPr>
-        <w:spacing w:before="60" w:after="0" w:line="252" w:lineRule="auto"/>
+        <w:spacing w:before="60" w:after="0" w:line="250" w:lineRule="exact"/>
       </w:pPr>
       <w:r>
         <w:rPr>
-          <w:rFonts w:ascii="游明朝" w:hAnsi="游明朝" w:eastAsia="游明朝"/>
+          <w:rFonts w:ascii="MS 明朝" w:hAnsi="MS 明朝" w:eastAsia="MS 明朝"/>
           <w:b/>
         </w:rPr>
-        <w:t>第6条（複製の制限）</w:t>
+        <w:t>第6条（返還・破棄）</w:t>
       </w:r>
     </w:p>
     <w:p>
       <w:pPr>
-        <w:spacing w:before="0" w:after="40" w:line="252" w:lineRule="auto"/>
+        <w:spacing w:before="0" w:after="40" w:line="250" w:lineRule="exact"/>
         <w:ind w:left="227"/>
       </w:pPr>
       <w:r>
         <w:rPr>
-          <w:rFonts w:ascii="游明朝" w:hAnsi="游明朝" w:eastAsia="游明朝"/>
+          <w:rFonts w:ascii="MS 明朝" w:hAnsi="MS 明朝" w:eastAsia="MS 明朝"/>
           <w:b w:val="0"/>
         </w:rPr>
-        <w:t>乙は、本目的に必要な範囲を超えて、秘密情報を複製・撮影・録音・記録してはならない。複製物も秘密情報として扱う。</w:t>
+        <w:t>乙は、甲の請求時または本契約終了時に、秘密情報（複製物を含む）を速やかに返還または破棄し、その旨を甲に書面で報告する。</w:t>
       </w:r>
     </w:p>
     <w:p>
       <w:pPr>
-        <w:spacing w:before="60" w:after="0" w:line="252" w:lineRule="auto"/>
+        <w:spacing w:before="60" w:after="0" w:line="250" w:lineRule="exact"/>
       </w:pPr>
       <w:r>
         <w:rPr>
-          <w:rFonts w:ascii="游明朝" w:hAnsi="游明朝" w:eastAsia="游明朝"/>
+          <w:rFonts w:ascii="MS 明朝" w:hAnsi="MS 明朝" w:eastAsia="MS 明朝"/>
           <w:b/>
         </w:rPr>
-        <w:t>第7条（返還・破棄）</w:t>
+        <w:t>第7条（有効期間）</w:t>
       </w:r>
     </w:p>
     <w:p>
       <w:pPr>
-        <w:spacing w:before="0" w:after="40" w:line="252" w:lineRule="auto"/>
+        <w:spacing w:before="0" w:after="40" w:line="250" w:lineRule="exact"/>
         <w:ind w:left="227"/>
       </w:pPr>
       <w:r>
         <w:rPr>
-          <w:rFonts w:ascii="游明朝" w:hAnsi="游明朝" w:eastAsia="游明朝"/>
-          <w:b w:val="0"/>
-        </w:rPr>
-        <w:t>乙は、甲の請求があったときまたは本契約終了時に、甲の指示に従い、秘密情報（複製物を含む）を速やかに返還または破棄（電磁的記録の完全消去を含む）し、その旨を書面で報告する。</w:t>
-      </w:r>
-    </w:p>
-    <w:p>
-      <w:pPr>
-        <w:spacing w:before="60" w:after="0" w:line="252" w:lineRule="auto"/>
-      </w:pPr>
-      <w:r>
-        <w:rPr>
-          <w:rFonts w:ascii="游明朝" w:hAnsi="游明朝" w:eastAsia="游明朝"/>
-          <w:b/>
-        </w:rPr>
-        <w:t>第8条（有効期間）</w:t>
-      </w:r>
-    </w:p>
-    <w:p>
-      <w:pPr>
-        <w:spacing w:before="0" w:after="40" w:line="252" w:lineRule="auto"/>
-        <w:ind w:left="227"/>
-      </w:pPr>
-      <w:r>
-        <w:rPr>
-          <w:rFonts w:ascii="游明朝" w:hAnsi="游明朝" w:eastAsia="游明朝"/>
+          <w:rFonts w:ascii="MS 明朝" w:hAnsi="MS 明朝" w:eastAsia="MS 明朝"/>
           <w:b w:val="0"/>
         </w:rPr>
         <w:t>本契約の有効期間は、契約締結日から永年とする。</w:t>
@@ -282,113 +244,87 @@
     </w:p>
     <w:p>
       <w:pPr>
-        <w:spacing w:before="60" w:after="0" w:line="252" w:lineRule="auto"/>
+        <w:spacing w:before="60" w:after="0" w:line="250" w:lineRule="exact"/>
       </w:pPr>
       <w:r>
         <w:rPr>
-          <w:rFonts w:ascii="游明朝" w:hAnsi="游明朝" w:eastAsia="游明朝"/>
+          <w:rFonts w:ascii="MS 明朝" w:hAnsi="MS 明朝" w:eastAsia="MS 明朝"/>
           <w:b/>
         </w:rPr>
-        <w:t>第9条（損害賠償・差止め）</w:t>
+        <w:t>第8条（損害賠償・差止め）</w:t>
       </w:r>
     </w:p>
     <w:p>
       <w:pPr>
-        <w:spacing w:before="0" w:after="40" w:line="252" w:lineRule="auto"/>
+        <w:spacing w:before="0" w:after="40" w:line="250" w:lineRule="exact"/>
         <w:ind w:left="227"/>
       </w:pPr>
       <w:r>
         <w:rPr>
-          <w:rFonts w:ascii="游明朝" w:hAnsi="游明朝" w:eastAsia="游明朝"/>
+          <w:rFonts w:ascii="MS 明朝" w:hAnsi="MS 明朝" w:eastAsia="MS 明朝"/>
           <w:b w:val="0"/>
         </w:rPr>
-        <w:t>1. 乙が本契約に違反し、甲に損害が生じたときは、乙はその損害を賠償する責任を負う。</w:t>
+        <w:t>乙が本契約に違反し、または違反するおそれがあるときは、甲は、乙に対し損害賠償を請求できるほか、違反行為の差止めを求めることができる。</w:t>
       </w:r>
     </w:p>
     <w:p>
       <w:pPr>
-        <w:spacing w:before="0" w:after="40" w:line="252" w:lineRule="auto"/>
+        <w:spacing w:before="60" w:after="0" w:line="250" w:lineRule="exact"/>
+      </w:pPr>
+      <w:r>
+        <w:rPr>
+          <w:rFonts w:ascii="MS 明朝" w:hAnsi="MS 明朝" w:eastAsia="MS 明朝"/>
+          <w:b/>
+        </w:rPr>
+        <w:t>第9条（権利の帰属等）</w:t>
+      </w:r>
+    </w:p>
+    <w:p>
+      <w:pPr>
+        <w:spacing w:before="0" w:after="40" w:line="250" w:lineRule="exact"/>
         <w:ind w:left="227"/>
       </w:pPr>
       <w:r>
         <w:rPr>
-          <w:rFonts w:ascii="游明朝" w:hAnsi="游明朝" w:eastAsia="游明朝"/>
+          <w:rFonts w:ascii="MS 明朝" w:hAnsi="MS 明朝" w:eastAsia="MS 明朝"/>
           <w:b w:val="0"/>
         </w:rPr>
-        <w:t>2. 甲は、乙が違反し、または違反するおそれがあるときは、損害賠償に加え、差止めその他必要な措置を求めることができる。</w:t>
+        <w:t>秘密情報に関する一切の権利は甲（または正当な権利者）に帰属する。乙は、甲の事前の書面による承諾なく、本契約上の地位・権利義務を第三者に譲渡してはならない。</w:t>
       </w:r>
     </w:p>
     <w:p>
       <w:pPr>
-        <w:spacing w:before="60" w:after="0" w:line="252" w:lineRule="auto"/>
+        <w:spacing w:before="60" w:after="0" w:line="250" w:lineRule="exact"/>
       </w:pPr>
       <w:r>
         <w:rPr>
-          <w:rFonts w:ascii="游明朝" w:hAnsi="游明朝" w:eastAsia="游明朝"/>
+          <w:rFonts w:ascii="MS 明朝" w:hAnsi="MS 明朝" w:eastAsia="MS 明朝"/>
           <w:b/>
         </w:rPr>
-        <w:t>第10条（権利の帰属等）</w:t>
+        <w:t>第10条（協議事項）</w:t>
       </w:r>
     </w:p>
     <w:p>
       <w:pPr>
-        <w:spacing w:before="0" w:after="40" w:line="252" w:lineRule="auto"/>
+        <w:spacing w:before="0" w:after="40" w:line="250" w:lineRule="exact"/>
         <w:ind w:left="227"/>
       </w:pPr>
       <w:r>
         <w:rPr>
-          <w:rFonts w:ascii="游明朝" w:hAnsi="游明朝" w:eastAsia="游明朝"/>
+          <w:rFonts w:ascii="MS 明朝" w:hAnsi="MS 明朝" w:eastAsia="MS 明朝"/>
           <w:b w:val="0"/>
         </w:rPr>
-        <w:t>1. 秘密情報に関する知的財産権その他一切の権利は、甲（または正当な権利者）に帰属し、本契約は権利の譲渡・使用許諾を意味しない。</w:t>
+        <w:t>本契約に定めのない事項は、甲乙誠意をもって協議のうえ解決する。</w:t>
       </w:r>
     </w:p>
     <w:p>
       <w:pPr>
-        <w:spacing w:before="0" w:after="40" w:line="252" w:lineRule="auto"/>
-        <w:ind w:left="227"/>
-      </w:pPr>
-      <w:r>
-        <w:rPr>
-          <w:rFonts w:ascii="游明朝" w:hAnsi="游明朝" w:eastAsia="游明朝"/>
-          <w:b w:val="0"/>
-        </w:rPr>
-        <w:t>2. 乙は、甲の事前の書面による承諾なく、本契約上の地位・権利義務を第三者に譲渡・承継させてはならない。</w:t>
-      </w:r>
-    </w:p>
-    <w:p>
-      <w:pPr>
-        <w:spacing w:before="60" w:after="0" w:line="252" w:lineRule="auto"/>
-      </w:pPr>
-      <w:r>
-        <w:rPr>
-          <w:rFonts w:ascii="游明朝" w:hAnsi="游明朝" w:eastAsia="游明朝"/>
-          <w:b/>
-        </w:rPr>
-        <w:t>第11条（協議事項）</w:t>
-      </w:r>
-    </w:p>
-    <w:p>
-      <w:pPr>
-        <w:spacing w:before="0" w:after="40" w:line="252" w:lineRule="auto"/>
-        <w:ind w:left="227"/>
-      </w:pPr>
-      <w:r>
-        <w:rPr>
-          <w:rFonts w:ascii="游明朝" w:hAnsi="游明朝" w:eastAsia="游明朝"/>
-          <w:b w:val="0"/>
-        </w:rPr>
-        <w:t>本契約に定めのない事項や疑義が生じた事項は、甲乙誠意をもって協議のうえ解決する。</w:t>
-      </w:r>
-    </w:p>
-    <w:p>
-      <w:pPr>
-        <w:spacing w:before="100" w:after="60" w:line="252" w:lineRule="auto"/>
+        <w:spacing w:before="160" w:after="80" w:line="250" w:lineRule="exact"/>
         <w:jc w:val="right"/>
       </w:pPr>
       <w:r>
         <w:rPr>
-          <w:rFonts w:ascii="游明朝" w:hAnsi="游明朝" w:eastAsia="游明朝"/>
+          <w:rFonts w:ascii="MS 明朝" w:hAnsi="MS 明朝" w:eastAsia="MS 明朝"/>
           <w:b w:val="0"/>
         </w:rPr>
         <w:t>契約締結日：令和　　年　　月　　日</w:t>
@@ -401,9 +337,9 @@
         <w:tblLook w:firstColumn="1" w:firstRow="1" w:lastColumn="0" w:lastRow="0" w:noHBand="0" w:noVBand="1" w:val="04A0"/>
       </w:tblPr>
       <w:tblGrid>
-        <w:gridCol w:w="3289"/>
-        <w:gridCol w:w="3289"/>
-        <w:gridCol w:w="3289"/>
+        <w:gridCol w:w="3213"/>
+        <w:gridCol w:w="3213"/>
+        <w:gridCol w:w="3213"/>
       </w:tblGrid>
       <w:tr>
         <w:trPr>
@@ -411,7 +347,7 @@
         </w:trPr>
         <w:tc>
           <w:tcPr>
-            <w:tcW w:type="dxa" w:w="1587"/>
+            <w:tcW w:type="dxa" w:w="1474"/>
           </w:tcPr>
           <w:p>
             <w:pPr>
@@ -420,7 +356,7 @@
             <w:r/>
             <w:r>
               <w:rPr>
-                <w:rFonts w:ascii="游明朝" w:hAnsi="游明朝" w:eastAsia="游明朝"/>
+                <w:rFonts w:ascii="MS 明朝" w:hAnsi="MS 明朝" w:eastAsia="MS 明朝"/>
                 <w:b/>
               </w:rPr>
             </w:r>
@@ -428,7 +364,7 @@
         </w:tc>
         <w:tc>
           <w:tcPr>
-            <w:tcW w:type="dxa" w:w="4139"/>
+            <w:tcW w:type="dxa" w:w="4082"/>
           </w:tcPr>
           <w:p>
             <w:pPr>
@@ -437,7 +373,7 @@
             <w:r/>
             <w:r>
               <w:rPr>
-                <w:rFonts w:ascii="游明朝" w:hAnsi="游明朝" w:eastAsia="游明朝"/>
+                <w:rFonts w:ascii="MS 明朝" w:hAnsi="MS 明朝" w:eastAsia="MS 明朝"/>
                 <w:b/>
               </w:rPr>
               <w:t>甲（開示する側）</w:t>
@@ -446,7 +382,7 @@
         </w:tc>
         <w:tc>
           <w:tcPr>
-            <w:tcW w:type="dxa" w:w="4139"/>
+            <w:tcW w:type="dxa" w:w="4082"/>
           </w:tcPr>
           <w:p>
             <w:pPr>
@@ -455,7 +391,7 @@
             <w:r/>
             <w:r>
               <w:rPr>
-                <w:rFonts w:ascii="游明朝" w:hAnsi="游明朝" w:eastAsia="游明朝"/>
+                <w:rFonts w:ascii="MS 明朝" w:hAnsi="MS 明朝" w:eastAsia="MS 明朝"/>
                 <w:b/>
               </w:rPr>
               <w:t>乙（受領する側）</w:t>
@@ -465,11 +401,11 @@
       </w:tr>
       <w:tr>
         <w:trPr>
-          <w:trHeight w:val="794"/>
+          <w:trHeight w:val="907"/>
         </w:trPr>
         <w:tc>
           <w:tcPr>
-            <w:tcW w:type="dxa" w:w="1587"/>
+            <w:tcW w:type="dxa" w:w="1474"/>
           </w:tcPr>
           <w:p>
             <w:pPr>
@@ -478,7 +414,7 @@
             <w:r/>
             <w:r>
               <w:rPr>
-                <w:rFonts w:ascii="游明朝" w:hAnsi="游明朝" w:eastAsia="游明朝"/>
+                <w:rFonts w:ascii="MS 明朝" w:hAnsi="MS 明朝" w:eastAsia="MS 明朝"/>
                 <w:b/>
               </w:rPr>
               <w:t>住所</w:t>
@@ -487,26 +423,26 @@
         </w:tc>
         <w:tc>
           <w:tcPr>
-            <w:tcW w:type="dxa" w:w="4139"/>
+            <w:tcW w:type="dxa" w:w="4082"/>
           </w:tcPr>
           <w:p>
             <w:r/>
             <w:r>
               <w:rPr>
-                <w:rFonts w:ascii="游明朝" w:hAnsi="游明朝" w:eastAsia="游明朝"/>
+                <w:rFonts w:ascii="MS 明朝" w:hAnsi="MS 明朝" w:eastAsia="MS 明朝"/>
               </w:rPr>
             </w:r>
           </w:p>
         </w:tc>
         <w:tc>
           <w:tcPr>
-            <w:tcW w:type="dxa" w:w="4139"/>
+            <w:tcW w:type="dxa" w:w="4082"/>
           </w:tcPr>
           <w:p>
             <w:r/>
             <w:r>
               <w:rPr>
-                <w:rFonts w:ascii="游明朝" w:hAnsi="游明朝" w:eastAsia="游明朝"/>
+                <w:rFonts w:ascii="MS 明朝" w:hAnsi="MS 明朝" w:eastAsia="MS 明朝"/>
               </w:rPr>
             </w:r>
           </w:p>
@@ -514,11 +450,11 @@
       </w:tr>
       <w:tr>
         <w:trPr>
-          <w:trHeight w:val="794"/>
+          <w:trHeight w:val="907"/>
         </w:trPr>
         <w:tc>
           <w:tcPr>
-            <w:tcW w:type="dxa" w:w="1587"/>
+            <w:tcW w:type="dxa" w:w="1474"/>
           </w:tcPr>
           <w:p>
             <w:pPr>
@@ -527,7 +463,7 @@
             <w:r/>
             <w:r>
               <w:rPr>
-                <w:rFonts w:ascii="游明朝" w:hAnsi="游明朝" w:eastAsia="游明朝"/>
+                <w:rFonts w:ascii="MS 明朝" w:hAnsi="MS 明朝" w:eastAsia="MS 明朝"/>
                 <w:b/>
               </w:rPr>
               <w:t>氏名・名称</w:t>
@@ -536,26 +472,26 @@
         </w:tc>
         <w:tc>
           <w:tcPr>
-            <w:tcW w:type="dxa" w:w="4139"/>
+            <w:tcW w:type="dxa" w:w="4082"/>
           </w:tcPr>
           <w:p>
             <w:r/>
             <w:r>
               <w:rPr>
-                <w:rFonts w:ascii="游明朝" w:hAnsi="游明朝" w:eastAsia="游明朝"/>
+                <w:rFonts w:ascii="MS 明朝" w:hAnsi="MS 明朝" w:eastAsia="MS 明朝"/>
               </w:rPr>
             </w:r>
           </w:p>
         </w:tc>
         <w:tc>
           <w:tcPr>
-            <w:tcW w:type="dxa" w:w="4139"/>
+            <w:tcW w:type="dxa" w:w="4082"/>
           </w:tcPr>
           <w:p>
             <w:r/>
             <w:r>
               <w:rPr>
-                <w:rFonts w:ascii="游明朝" w:hAnsi="游明朝" w:eastAsia="游明朝"/>
+                <w:rFonts w:ascii="MS 明朝" w:hAnsi="MS 明朝" w:eastAsia="MS 明朝"/>
               </w:rPr>
             </w:r>
           </w:p>
@@ -563,11 +499,11 @@
       </w:tr>
       <w:tr>
         <w:trPr>
-          <w:trHeight w:val="794"/>
+          <w:trHeight w:val="907"/>
         </w:trPr>
         <w:tc>
           <w:tcPr>
-            <w:tcW w:type="dxa" w:w="1587"/>
+            <w:tcW w:type="dxa" w:w="1474"/>
           </w:tcPr>
           <w:p>
             <w:pPr>
@@ -576,7 +512,7 @@
             <w:r/>
             <w:r>
               <w:rPr>
-                <w:rFonts w:ascii="游明朝" w:hAnsi="游明朝" w:eastAsia="游明朝"/>
+                <w:rFonts w:ascii="MS 明朝" w:hAnsi="MS 明朝" w:eastAsia="MS 明朝"/>
                 <w:b/>
               </w:rPr>
               <w:t>署名・押印</w:t>
@@ -585,26 +521,26 @@
         </w:tc>
         <w:tc>
           <w:tcPr>
-            <w:tcW w:type="dxa" w:w="4139"/>
+            <w:tcW w:type="dxa" w:w="4082"/>
           </w:tcPr>
           <w:p>
             <w:r/>
             <w:r>
               <w:rPr>
-                <w:rFonts w:ascii="游明朝" w:hAnsi="游明朝" w:eastAsia="游明朝"/>
+                <w:rFonts w:ascii="MS 明朝" w:hAnsi="MS 明朝" w:eastAsia="MS 明朝"/>
               </w:rPr>
             </w:r>
           </w:p>
         </w:tc>
         <w:tc>
           <w:tcPr>
-            <w:tcW w:type="dxa" w:w="4139"/>
+            <w:tcW w:type="dxa" w:w="4082"/>
           </w:tcPr>
           <w:p>
             <w:r/>
             <w:r>
               <w:rPr>
-                <w:rFonts w:ascii="游明朝" w:hAnsi="游明朝" w:eastAsia="游明朝"/>
+                <w:rFonts w:ascii="MS 明朝" w:hAnsi="MS 明朝" w:eastAsia="MS 明朝"/>
               </w:rPr>
             </w:r>
           </w:p>
@@ -613,7 +549,7 @@
     </w:tbl>
     <w:sectPr>
       <w:pgSz w:w="11906" w:h="16838"/>
-      <w:pgMar w:top="680" w:right="1020" w:bottom="680" w:left="1020" w:header="720" w:footer="720" w:gutter="0"/>
+      <w:pgMar w:top="850" w:right="1134" w:bottom="850" w:left="1134" w:header="720" w:footer="720" w:gutter="0"/>
       <w:cols w:space="720"/>
       <w:docGrid w:linePitch="360"/>
     </w:sectPr>
@@ -985,8 +921,8 @@
     <w:qFormat/>
     <w:rsid w:val="00FC693F"/>
     <w:rPr>
-      <w:rFonts w:ascii="游明朝" w:hAnsi="游明朝" w:eastAsia="游明朝"/>
-      <w:sz w:val="19"/>
+      <w:rFonts w:ascii="MS 明朝" w:hAnsi="MS 明朝" w:eastAsia="MS 明朝"/>
+      <w:sz w:val="18"/>
     </w:rPr>
   </w:style>
   <w:style w:type="paragraph" w:styleId="Header">

</xml_diff>

<commit_message>
Make one-page NDA fit A4 with more margin; add simplex PDF
Co-Authored-By: Claude Sonnet 5.5 <noreply@anthropic.com>
Claude-Session: https://claude.ai/code/session_01TRZ9tz7efyNXVsPx8VtPvB
</commit_message>
<xml_diff>
--- a/秘密保持契約書_要約1枚版.docx
+++ b/秘密保持契約書_要約1枚版.docx
@@ -4,7 +4,7 @@
   <w:body>
     <w:p>
       <w:pPr>
-        <w:spacing w:before="0" w:after="120" w:line="250" w:lineRule="exact"/>
+        <w:spacing w:before="0" w:after="120" w:line="240" w:lineRule="exact"/>
         <w:jc w:val="center"/>
       </w:pPr>
       <w:r>
@@ -18,7 +18,7 @@
     </w:p>
     <w:p>
       <w:pPr>
-        <w:spacing w:before="0" w:after="60" w:line="250" w:lineRule="exact"/>
+        <w:spacing w:before="0" w:after="60" w:line="240" w:lineRule="exact"/>
       </w:pPr>
       <w:r>
         <w:rPr>
@@ -30,7 +30,7 @@
     </w:p>
     <w:p>
       <w:pPr>
-        <w:spacing w:before="60" w:after="0" w:line="250" w:lineRule="exact"/>
+        <w:spacing w:before="60" w:after="0" w:line="240" w:lineRule="exact"/>
       </w:pPr>
       <w:r>
         <w:rPr>
@@ -42,7 +42,7 @@
     </w:p>
     <w:p>
       <w:pPr>
-        <w:spacing w:before="0" w:after="40" w:line="250" w:lineRule="exact"/>
+        <w:spacing w:before="0" w:after="40" w:line="240" w:lineRule="exact"/>
         <w:ind w:left="227"/>
       </w:pPr>
       <w:r>
@@ -55,7 +55,7 @@
     </w:p>
     <w:p>
       <w:pPr>
-        <w:spacing w:before="60" w:after="0" w:line="250" w:lineRule="exact"/>
+        <w:spacing w:before="60" w:after="0" w:line="240" w:lineRule="exact"/>
       </w:pPr>
       <w:r>
         <w:rPr>
@@ -67,7 +67,7 @@
     </w:p>
     <w:p>
       <w:pPr>
-        <w:spacing w:before="0" w:after="40" w:line="250" w:lineRule="exact"/>
+        <w:spacing w:before="0" w:after="40" w:line="240" w:lineRule="exact"/>
         <w:ind w:left="227"/>
       </w:pPr>
       <w:r>
@@ -80,7 +80,7 @@
     </w:p>
     <w:p>
       <w:pPr>
-        <w:spacing w:before="0" w:after="40" w:line="250" w:lineRule="exact"/>
+        <w:spacing w:before="0" w:after="40" w:line="240" w:lineRule="exact"/>
         <w:ind w:left="227"/>
       </w:pPr>
       <w:r>
@@ -93,7 +93,7 @@
     </w:p>
     <w:p>
       <w:pPr>
-        <w:spacing w:before="60" w:after="0" w:line="250" w:lineRule="exact"/>
+        <w:spacing w:before="60" w:after="0" w:line="240" w:lineRule="exact"/>
       </w:pPr>
       <w:r>
         <w:rPr>
@@ -105,7 +105,7 @@
     </w:p>
     <w:p>
       <w:pPr>
-        <w:spacing w:before="0" w:after="40" w:line="250" w:lineRule="exact"/>
+        <w:spacing w:before="0" w:after="40" w:line="240" w:lineRule="exact"/>
         <w:ind w:left="227"/>
       </w:pPr>
       <w:r>
@@ -118,7 +118,7 @@
     </w:p>
     <w:p>
       <w:pPr>
-        <w:spacing w:before="0" w:after="40" w:line="250" w:lineRule="exact"/>
+        <w:spacing w:before="0" w:after="40" w:line="240" w:lineRule="exact"/>
         <w:ind w:left="227"/>
       </w:pPr>
       <w:r>
@@ -131,7 +131,7 @@
     </w:p>
     <w:p>
       <w:pPr>
-        <w:spacing w:before="60" w:after="0" w:line="250" w:lineRule="exact"/>
+        <w:spacing w:before="60" w:after="0" w:line="240" w:lineRule="exact"/>
       </w:pPr>
       <w:r>
         <w:rPr>
@@ -143,7 +143,7 @@
     </w:p>
     <w:p>
       <w:pPr>
-        <w:spacing w:before="0" w:after="40" w:line="250" w:lineRule="exact"/>
+        <w:spacing w:before="0" w:after="40" w:line="240" w:lineRule="exact"/>
         <w:ind w:left="227"/>
       </w:pPr>
       <w:r>
@@ -156,7 +156,7 @@
     </w:p>
     <w:p>
       <w:pPr>
-        <w:spacing w:before="60" w:after="0" w:line="250" w:lineRule="exact"/>
+        <w:spacing w:before="60" w:after="0" w:line="240" w:lineRule="exact"/>
       </w:pPr>
       <w:r>
         <w:rPr>
@@ -168,7 +168,7 @@
     </w:p>
     <w:p>
       <w:pPr>
-        <w:spacing w:before="0" w:after="40" w:line="250" w:lineRule="exact"/>
+        <w:spacing w:before="0" w:after="40" w:line="240" w:lineRule="exact"/>
         <w:ind w:left="227"/>
       </w:pPr>
       <w:r>
@@ -181,7 +181,7 @@
     </w:p>
     <w:p>
       <w:pPr>
-        <w:spacing w:before="0" w:after="40" w:line="250" w:lineRule="exact"/>
+        <w:spacing w:before="0" w:after="40" w:line="240" w:lineRule="exact"/>
         <w:ind w:left="227"/>
       </w:pPr>
       <w:r>
@@ -194,7 +194,7 @@
     </w:p>
     <w:p>
       <w:pPr>
-        <w:spacing w:before="60" w:after="0" w:line="250" w:lineRule="exact"/>
+        <w:spacing w:before="60" w:after="0" w:line="240" w:lineRule="exact"/>
       </w:pPr>
       <w:r>
         <w:rPr>
@@ -206,7 +206,7 @@
     </w:p>
     <w:p>
       <w:pPr>
-        <w:spacing w:before="0" w:after="40" w:line="250" w:lineRule="exact"/>
+        <w:spacing w:before="0" w:after="40" w:line="240" w:lineRule="exact"/>
         <w:ind w:left="227"/>
       </w:pPr>
       <w:r>
@@ -219,7 +219,7 @@
     </w:p>
     <w:p>
       <w:pPr>
-        <w:spacing w:before="60" w:after="0" w:line="250" w:lineRule="exact"/>
+        <w:spacing w:before="60" w:after="0" w:line="240" w:lineRule="exact"/>
       </w:pPr>
       <w:r>
         <w:rPr>
@@ -231,7 +231,7 @@
     </w:p>
     <w:p>
       <w:pPr>
-        <w:spacing w:before="0" w:after="40" w:line="250" w:lineRule="exact"/>
+        <w:spacing w:before="0" w:after="40" w:line="240" w:lineRule="exact"/>
         <w:ind w:left="227"/>
       </w:pPr>
       <w:r>
@@ -244,7 +244,7 @@
     </w:p>
     <w:p>
       <w:pPr>
-        <w:spacing w:before="60" w:after="0" w:line="250" w:lineRule="exact"/>
+        <w:spacing w:before="60" w:after="0" w:line="240" w:lineRule="exact"/>
       </w:pPr>
       <w:r>
         <w:rPr>
@@ -256,7 +256,7 @@
     </w:p>
     <w:p>
       <w:pPr>
-        <w:spacing w:before="0" w:after="40" w:line="250" w:lineRule="exact"/>
+        <w:spacing w:before="0" w:after="40" w:line="240" w:lineRule="exact"/>
         <w:ind w:left="227"/>
       </w:pPr>
       <w:r>
@@ -269,7 +269,7 @@
     </w:p>
     <w:p>
       <w:pPr>
-        <w:spacing w:before="60" w:after="0" w:line="250" w:lineRule="exact"/>
+        <w:spacing w:before="60" w:after="0" w:line="240" w:lineRule="exact"/>
       </w:pPr>
       <w:r>
         <w:rPr>
@@ -281,7 +281,7 @@
     </w:p>
     <w:p>
       <w:pPr>
-        <w:spacing w:before="0" w:after="40" w:line="250" w:lineRule="exact"/>
+        <w:spacing w:before="0" w:after="40" w:line="240" w:lineRule="exact"/>
         <w:ind w:left="227"/>
       </w:pPr>
       <w:r>
@@ -294,7 +294,7 @@
     </w:p>
     <w:p>
       <w:pPr>
-        <w:spacing w:before="60" w:after="0" w:line="250" w:lineRule="exact"/>
+        <w:spacing w:before="60" w:after="0" w:line="240" w:lineRule="exact"/>
       </w:pPr>
       <w:r>
         <w:rPr>
@@ -306,7 +306,7 @@
     </w:p>
     <w:p>
       <w:pPr>
-        <w:spacing w:before="0" w:after="40" w:line="250" w:lineRule="exact"/>
+        <w:spacing w:before="0" w:after="40" w:line="240" w:lineRule="exact"/>
         <w:ind w:left="227"/>
       </w:pPr>
       <w:r>
@@ -319,7 +319,7 @@
     </w:p>
     <w:p>
       <w:pPr>
-        <w:spacing w:before="160" w:after="80" w:line="250" w:lineRule="exact"/>
+        <w:spacing w:before="100" w:after="60" w:line="240" w:lineRule="exact"/>
         <w:jc w:val="right"/>
       </w:pPr>
       <w:r>
@@ -401,7 +401,7 @@
       </w:tr>
       <w:tr>
         <w:trPr>
-          <w:trHeight w:val="907"/>
+          <w:trHeight w:val="737"/>
         </w:trPr>
         <w:tc>
           <w:tcPr>
@@ -450,7 +450,7 @@
       </w:tr>
       <w:tr>
         <w:trPr>
-          <w:trHeight w:val="907"/>
+          <w:trHeight w:val="737"/>
         </w:trPr>
         <w:tc>
           <w:tcPr>
@@ -499,7 +499,7 @@
       </w:tr>
       <w:tr>
         <w:trPr>
-          <w:trHeight w:val="907"/>
+          <w:trHeight w:val="737"/>
         </w:trPr>
         <w:tc>
           <w:tcPr>

</xml_diff>